<commit_message>
Oferta jako P.P.U.H. M-ELEKTROSTATYK, 420 zł netto/szt.
Aktualizacja formularza USCiSO.2151.13.2026: dane Wykonawcy
M-ELEKTROSTATYK (Szamotowa 16A) oraz cena 15 × 420,00 netto
= 6 300,00 netto / 7 749,00 brutto.

Co-authored-by: KonradCuzo <KonradCuzo@users.noreply.github.com>
</commit_message>
<xml_diff>
--- a/oferta-opole-lubelskie-usciso-2151-13-2026/Formularz_ofertowy_USCiSO.2151.13.2026.docx
+++ b/oferta-opole-lubelskie-usciso-2151-13-2026/Formularz_ofertowy_USCiSO.2151.13.2026.docx
@@ -4,7 +4,7 @@
   <w:body>
     <w:p>
       <w:pPr>
-        <w:spacing w:after="240" w:before="0" w:line="276" w:lineRule="auto"/>
+        <w:spacing w:after="240" w:before="0"/>
         <w:jc w:val="right"/>
       </w:pPr>
       <w:r>
@@ -19,7 +19,7 @@
     </w:p>
     <w:p>
       <w:pPr>
-        <w:spacing w:after="40" w:before="0" w:line="276" w:lineRule="auto"/>
+        <w:spacing w:after="40" w:before="0"/>
         <w:jc w:val="center"/>
       </w:pPr>
       <w:r>
@@ -34,7 +34,7 @@
     </w:p>
     <w:p>
       <w:pPr>
-        <w:spacing w:after="40" w:before="0" w:line="276" w:lineRule="auto"/>
+        <w:spacing w:after="40" w:before="0"/>
         <w:jc w:val="center"/>
       </w:pPr>
       <w:r>
@@ -49,7 +49,7 @@
     </w:p>
     <w:p>
       <w:pPr>
-        <w:spacing w:after="280" w:before="0" w:line="276" w:lineRule="auto"/>
+        <w:spacing w:after="280" w:before="0"/>
         <w:jc w:val="center"/>
       </w:pPr>
       <w:r>
@@ -64,7 +64,7 @@
     </w:p>
     <w:p>
       <w:pPr>
-        <w:spacing w:after="120" w:before="0" w:line="276" w:lineRule="auto"/>
+        <w:spacing w:after="120" w:before="0"/>
       </w:pPr>
       <w:r>
         <w:rPr>
@@ -78,7 +78,7 @@
     </w:p>
     <w:p>
       <w:pPr>
-        <w:spacing w:after="40" w:before="0" w:line="276" w:lineRule="auto"/>
+        <w:spacing w:after="40" w:before="0"/>
       </w:pPr>
       <w:r>
         <w:rPr>
@@ -87,12 +87,12 @@
           <w:i w:val="0"/>
           <w:sz w:val="22"/>
         </w:rPr>
-        <w:t>CUZO Jolanta Ledwoń</w:t>
+        <w:t>P.P.U.H. M-ELEKTROSTATYK</w:t>
       </w:r>
     </w:p>
     <w:p>
       <w:pPr>
-        <w:spacing w:after="40" w:before="0" w:line="276" w:lineRule="auto"/>
+        <w:spacing w:after="40" w:before="0"/>
       </w:pPr>
       <w:r>
         <w:rPr>
@@ -101,12 +101,12 @@
           <w:i w:val="0"/>
           <w:sz w:val="22"/>
         </w:rPr>
-        <w:t>ul. Uczniowska 12</w:t>
+        <w:t>ul. Szamotowa 16A</w:t>
       </w:r>
     </w:p>
     <w:p>
       <w:pPr>
-        <w:spacing w:after="120" w:before="0" w:line="276" w:lineRule="auto"/>
+        <w:spacing w:after="120" w:before="0"/>
       </w:pPr>
       <w:r>
         <w:rPr>
@@ -115,7 +115,7 @@
           <w:i w:val="0"/>
           <w:sz w:val="22"/>
         </w:rPr>
-        <w:t>42-280 Częstochowa</w:t>
+        <w:t>42-200 Częstochowa</w:t>
       </w:r>
     </w:p>
     <w:p>
@@ -138,7 +138,7 @@
           <w:i w:val="0"/>
           <w:sz w:val="22"/>
         </w:rPr>
-        <w:t>cuzo@cuzo.eu</w:t>
+        <w:t>biuro@elektrostatyk.com</w:t>
       </w:r>
     </w:p>
     <w:p>
@@ -161,7 +161,7 @@
           <w:i w:val="0"/>
           <w:sz w:val="22"/>
         </w:rPr>
-        <w:t>506 171 003</w:t>
+        <w:t>+48 34 324 6095</w:t>
       </w:r>
     </w:p>
     <w:p>
@@ -207,7 +207,7 @@
           <w:i w:val="0"/>
           <w:sz w:val="22"/>
         </w:rPr>
-        <w:t>5732627534</w:t>
+        <w:t>573-021-33-37</w:t>
       </w:r>
       <w:r>
         <w:rPr>
@@ -234,7 +234,7 @@
           <w:i w:val="0"/>
           <w:sz w:val="22"/>
         </w:rPr>
-        <w:t>382943659</w:t>
+        <w:t>150638120</w:t>
       </w:r>
     </w:p>
     <w:p>
@@ -272,7 +272,7 @@
     </w:p>
     <w:p>
       <w:pPr>
-        <w:spacing w:after="120" w:before="0" w:line="276" w:lineRule="auto"/>
+        <w:spacing w:after="120" w:before="0"/>
       </w:pPr>
       <w:r>
         <w:rPr>
@@ -286,7 +286,7 @@
     </w:p>
     <w:p>
       <w:pPr>
-        <w:spacing w:after="160" w:before="0" w:line="276" w:lineRule="auto"/>
+        <w:spacing w:after="160" w:before="0"/>
       </w:pPr>
       <w:r>
         <w:rPr>
@@ -318,7 +318,7 @@
           <w:i w:val="0"/>
           <w:sz w:val="24"/>
         </w:rPr>
-        <w:t>7 560,98 zł</w:t>
+        <w:t>6 300,00 zł</w:t>
       </w:r>
     </w:p>
     <w:p>
@@ -341,7 +341,7 @@
           <w:i w:val="0"/>
           <w:sz w:val="22"/>
         </w:rPr>
-        <w:t>siedem tysięcy pięćset sześćdziesiąt złotych 98/100</w:t>
+        <w:t>sześć tysięcy trzysta złotych 00/100</w:t>
       </w:r>
     </w:p>
     <w:p>
@@ -364,7 +364,7 @@
           <w:i w:val="0"/>
           <w:sz w:val="24"/>
         </w:rPr>
-        <w:t>9 300,00 zł</w:t>
+        <w:t>7 749,00 zł</w:t>
       </w:r>
     </w:p>
     <w:p>
@@ -387,7 +387,7 @@
           <w:i w:val="0"/>
           <w:sz w:val="22"/>
         </w:rPr>
-        <w:t>dziewięć tysięcy trzysta złotych 00/100</w:t>
+        <w:t>siedem tysięcy siedemset czterdzieści dziewięć złotych 00/100</w:t>
       </w:r>
     </w:p>
     <w:p>
@@ -439,7 +439,7 @@
     </w:p>
     <w:p>
       <w:pPr>
-        <w:spacing w:after="40" w:before="0" w:line="276" w:lineRule="auto"/>
+        <w:spacing w:after="40" w:before="0"/>
       </w:pPr>
       <w:r>
         <w:rPr>
@@ -453,7 +453,7 @@
     </w:p>
     <w:p>
       <w:pPr>
-        <w:spacing w:after="240" w:before="0" w:line="276" w:lineRule="auto"/>
+        <w:spacing w:after="240" w:before="0"/>
       </w:pPr>
       <w:r>
         <w:rPr>
@@ -462,7 +462,7 @@
           <w:i/>
           <w:sz w:val="18"/>
         </w:rPr>
-        <w:t>15 szt. × 620,00 zł brutto/szt. (łóżko polowe WP5-2 z materacem, cena katalogowa cuzo.eu) = 9 300,00 zł brutto; VAT 23%; netto = 7 560,98 zł.</w:t>
+        <w:t>15 szt. × 420,00 zł netto/szt. (łóżko polowe WP5-2 z materacem) = 6 300,00 zł netto; VAT 23% = 1 449,00 zł; brutto = 7 749,00 zł (516,60 zł brutto/szt.).</w:t>
       </w:r>
     </w:p>
     <w:p>
@@ -494,7 +494,7 @@
           <w:i w:val="0"/>
           <w:sz w:val="22"/>
         </w:rPr>
-        <w:t xml:space="preserve"> / nie jestem** płatnikiem podatku VAT.</w:t>
+        <w:t xml:space="preserve"> / nie jestem ** płatnikiem podatku VAT.</w:t>
       </w:r>
     </w:p>
     <w:p>
@@ -532,7 +532,7 @@
     </w:p>
     <w:p>
       <w:pPr>
-        <w:spacing w:after="40" w:before="0" w:line="276" w:lineRule="auto"/>
+        <w:spacing w:after="40" w:before="0"/>
       </w:pPr>
       <w:r>
         <w:rPr>
@@ -546,7 +546,7 @@
     </w:p>
     <w:p>
       <w:pPr>
-        <w:spacing w:after="120" w:before="0" w:line="276" w:lineRule="auto"/>
+        <w:spacing w:after="120" w:before="0"/>
       </w:pPr>
       <w:r>
         <w:rPr>
@@ -560,7 +560,7 @@
     </w:p>
     <w:p>
       <w:pPr>
-        <w:spacing w:after="40" w:before="0" w:line="276" w:lineRule="auto"/>
+        <w:spacing w:after="40" w:before="0"/>
       </w:pPr>
       <w:r>
         <w:rPr>
@@ -574,7 +574,7 @@
     </w:p>
     <w:p>
       <w:pPr>
-        <w:spacing w:after="200" w:before="0" w:line="276" w:lineRule="auto"/>
+        <w:spacing w:after="200" w:before="0"/>
       </w:pPr>
       <w:r>
         <w:rPr>
@@ -588,7 +588,7 @@
     </w:p>
     <w:p>
       <w:pPr>
-        <w:spacing w:after="200" w:before="0" w:line="276" w:lineRule="auto"/>
+        <w:spacing w:after="200" w:before="0"/>
         <w:jc w:val="both"/>
       </w:pPr>
       <w:r>
@@ -603,7 +603,7 @@
     </w:p>
     <w:p>
       <w:pPr>
-        <w:spacing w:after="80" w:before="0" w:line="276" w:lineRule="auto"/>
+        <w:spacing w:after="80" w:before="0"/>
       </w:pPr>
       <w:r>
         <w:rPr>
@@ -617,7 +617,7 @@
     </w:p>
     <w:p>
       <w:pPr>
-        <w:spacing w:after="40" w:before="0" w:line="276" w:lineRule="auto"/>
+        <w:spacing w:after="40" w:before="0"/>
       </w:pPr>
       <w:r>
         <w:rPr>
@@ -631,7 +631,7 @@
     </w:p>
     <w:p>
       <w:pPr>
-        <w:spacing w:after="280" w:before="0" w:line="276" w:lineRule="auto"/>
+        <w:spacing w:after="280" w:before="0"/>
       </w:pPr>
       <w:r>
         <w:rPr>
@@ -640,13 +640,12 @@
           <w:i w:val="0"/>
           <w:sz w:val="22"/>
         </w:rPr>
-        <w:t>2. Karta katalogowa / opis produktu WP5-2 (cuzo.eu).</w:t>
+        <w:t>2. Karta katalogowa / opis produktu WP5-2.</w:t>
       </w:r>
     </w:p>
     <w:tbl>
       <w:tblPr>
         <w:tblW w:type="auto" w:w="0"/>
-        <w:tblLayout w:type="autofit"/>
         <w:tblLook w:firstColumn="1" w:firstRow="1" w:lastColumn="0" w:lastRow="0" w:noHBand="0" w:noVBand="1" w:val="04A0"/>
       </w:tblPr>
       <w:tblGrid>
@@ -707,7 +706,7 @@
                 <w:i w:val="0"/>
                 <w:sz w:val="20"/>
               </w:rPr>
-              <w:t>Jolanta Ledwoń / CUZO</w:t>
+              <w:t>P.P.U.H. M-ELEKTROSTATYK</w:t>
             </w:r>
           </w:p>
         </w:tc>
@@ -715,12 +714,12 @@
     </w:tbl>
     <w:p>
       <w:pPr>
-        <w:spacing w:after="320" w:before="0" w:line="276" w:lineRule="auto"/>
+        <w:spacing w:after="320" w:before="0"/>
       </w:pPr>
     </w:p>
     <w:p>
       <w:pPr>
-        <w:spacing w:after="80" w:before="0" w:line="276" w:lineRule="auto"/>
+        <w:spacing w:after="80" w:before="0"/>
       </w:pPr>
       <w:r>
         <w:rPr>
@@ -734,7 +733,7 @@
     </w:p>
     <w:p>
       <w:pPr>
-        <w:spacing w:after="80" w:before="0" w:line="276" w:lineRule="auto"/>
+        <w:spacing w:after="80" w:before="0"/>
       </w:pPr>
       <w:r>
         <w:rPr>

</xml_diff>

<commit_message>
Uzupełnij Word o formularz i załącznik specyfikacji
Pełny DOCX oferty M-ELEKTROSTATYK (cena 420 zł netto/szt.)
z tabelą zgodności technicznej WP5-2.

Co-authored-by: KonradCuzo <KonradCuzo@users.noreply.github.com>
</commit_message>
<xml_diff>
--- a/oferta-opole-lubelskie-usciso-2151-13-2026/Formularz_ofertowy_USCiSO.2151.13.2026.docx
+++ b/oferta-opole-lubelskie-usciso-2151-13-2026/Formularz_ofertowy_USCiSO.2151.13.2026.docx
@@ -4,7 +4,7 @@
   <w:body>
     <w:p>
       <w:pPr>
-        <w:spacing w:after="240" w:before="0"/>
+        <w:spacing w:after="200" w:before="0"/>
         <w:jc w:val="right"/>
       </w:pPr>
       <w:r>
@@ -27,14 +27,14 @@
           <w:rFonts w:ascii="Times New Roman" w:hAnsi="Times New Roman" w:eastAsia="Times New Roman"/>
           <w:b/>
           <w:i w:val="0"/>
-          <w:sz w:val="28"/>
+          <w:sz w:val="32"/>
         </w:rPr>
         <w:t>FORMULARZ OFERTOWY</w:t>
       </w:r>
     </w:p>
     <w:p>
       <w:pPr>
-        <w:spacing w:after="40" w:before="0"/>
+        <w:spacing w:after="20" w:before="0"/>
         <w:jc w:val="center"/>
       </w:pPr>
       <w:r>
@@ -49,7 +49,7 @@
     </w:p>
     <w:p>
       <w:pPr>
-        <w:spacing w:after="280" w:before="0"/>
+        <w:spacing w:after="240" w:before="0"/>
         <w:jc w:val="center"/>
       </w:pPr>
       <w:r>
@@ -65,13 +65,14 @@
     <w:p>
       <w:pPr>
         <w:spacing w:after="120" w:before="0"/>
+        <w:jc w:val="left"/>
       </w:pPr>
       <w:r>
         <w:rPr>
           <w:rFonts w:ascii="Times New Roman" w:hAnsi="Times New Roman" w:eastAsia="Times New Roman"/>
           <w:b/>
           <w:i w:val="0"/>
-          <w:sz w:val="22"/>
+          <w:sz w:val="24"/>
         </w:rPr>
         <w:t>I. Nazwa i adres Wykonawcy:</w:t>
       </w:r>
@@ -79,20 +80,22 @@
     <w:p>
       <w:pPr>
         <w:spacing w:after="40" w:before="0"/>
+        <w:jc w:val="left"/>
       </w:pPr>
       <w:r>
         <w:rPr>
           <w:rFonts w:ascii="Times New Roman" w:hAnsi="Times New Roman" w:eastAsia="Times New Roman"/>
           <w:b/>
           <w:i w:val="0"/>
-          <w:sz w:val="22"/>
+          <w:sz w:val="24"/>
         </w:rPr>
         <w:t>P.P.U.H. M-ELEKTROSTATYK</w:t>
       </w:r>
     </w:p>
     <w:p>
       <w:pPr>
-        <w:spacing w:after="40" w:before="0"/>
+        <w:spacing w:after="20" w:before="0"/>
+        <w:jc w:val="left"/>
       </w:pPr>
       <w:r>
         <w:rPr>
@@ -107,6 +110,7 @@
     <w:p>
       <w:pPr>
         <w:spacing w:after="120" w:before="0"/>
+        <w:jc w:val="left"/>
       </w:pPr>
       <w:r>
         <w:rPr>
@@ -121,6 +125,7 @@
     <w:p>
       <w:pPr>
         <w:spacing w:after="40" w:before="0"/>
+        <w:jc w:val="left"/>
       </w:pPr>
       <w:r>
         <w:rPr>
@@ -144,6 +149,7 @@
     <w:p>
       <w:pPr>
         <w:spacing w:after="40" w:before="0"/>
+        <w:jc w:val="left"/>
       </w:pPr>
       <w:r>
         <w:rPr>
@@ -167,6 +173,7 @@
     <w:p>
       <w:pPr>
         <w:spacing w:after="40" w:before="0"/>
+        <w:jc w:val="left"/>
       </w:pPr>
       <w:r>
         <w:rPr>
@@ -189,7 +196,8 @@
     </w:p>
     <w:p>
       <w:pPr>
-        <w:spacing w:after="240" w:before="0"/>
+        <w:spacing w:after="200" w:before="0"/>
+        <w:jc w:val="left"/>
       </w:pPr>
       <w:r>
         <w:rPr>
@@ -212,20 +220,11 @@
       <w:r>
         <w:rPr>
           <w:rFonts w:ascii="Times New Roman" w:hAnsi="Times New Roman" w:eastAsia="Times New Roman"/>
-          <w:b w:val="0"/>
-          <w:i w:val="0"/>
-          <w:sz w:val="22"/>
-        </w:rPr>
-        <w:t xml:space="preserve">          </w:t>
-      </w:r>
-      <w:r>
-        <w:rPr>
-          <w:rFonts w:ascii="Times New Roman" w:hAnsi="Times New Roman" w:eastAsia="Times New Roman"/>
           <w:b/>
           <w:i w:val="0"/>
           <w:sz w:val="22"/>
         </w:rPr>
-        <w:t xml:space="preserve">REGON: </w:t>
+        <w:t xml:space="preserve">          REGON: </w:t>
       </w:r>
       <w:r>
         <w:rPr>
@@ -239,7 +238,7 @@
     </w:p>
     <w:p>
       <w:pPr>
-        <w:spacing w:after="240" w:before="0"/>
+        <w:spacing w:after="200" w:before="0"/>
         <w:jc w:val="both"/>
       </w:pPr>
       <w:r>
@@ -272,21 +271,23 @@
     </w:p>
     <w:p>
       <w:pPr>
-        <w:spacing w:after="120" w:before="0"/>
+        <w:spacing w:after="80" w:before="0"/>
+        <w:jc w:val="left"/>
       </w:pPr>
       <w:r>
         <w:rPr>
           <w:rFonts w:ascii="Times New Roman" w:hAnsi="Times New Roman" w:eastAsia="Times New Roman"/>
           <w:b/>
           <w:i w:val="0"/>
-          <w:sz w:val="22"/>
+          <w:sz w:val="24"/>
         </w:rPr>
         <w:t>II. Cena oferty</w:t>
       </w:r>
     </w:p>
     <w:p>
       <w:pPr>
-        <w:spacing w:after="160" w:before="0"/>
+        <w:spacing w:after="120" w:before="0"/>
+        <w:jc w:val="left"/>
       </w:pPr>
       <w:r>
         <w:rPr>
@@ -298,101 +299,277 @@
         <w:t>Oferuję wykonanie przedmiotu zamówienia za:</w:t>
       </w:r>
     </w:p>
-    <w:p>
-      <w:pPr>
-        <w:spacing w:after="80" w:before="0"/>
-      </w:pPr>
-      <w:r>
-        <w:rPr>
-          <w:rFonts w:ascii="Times New Roman" w:hAnsi="Times New Roman" w:eastAsia="Times New Roman"/>
-          <w:b/>
-          <w:i w:val="0"/>
-          <w:sz w:val="22"/>
-        </w:rPr>
-        <w:t xml:space="preserve">Cenę netto: </w:t>
-      </w:r>
-      <w:r>
-        <w:rPr>
-          <w:rFonts w:ascii="Times New Roman" w:hAnsi="Times New Roman" w:eastAsia="Times New Roman"/>
-          <w:b/>
-          <w:i w:val="0"/>
-          <w:sz w:val="24"/>
-        </w:rPr>
-        <w:t>6 300,00 zł</w:t>
-      </w:r>
-    </w:p>
+    <w:tbl>
+      <w:tblPr>
+        <w:tblW w:type="auto" w:w="0"/>
+        <w:tblLayout w:type="autofit"/>
+        <w:tblLook w:firstColumn="1" w:firstRow="1" w:lastColumn="0" w:lastRow="0" w:noHBand="0" w:noVBand="1" w:val="04A0"/>
+      </w:tblPr>
+      <w:tblGrid>
+        <w:gridCol w:w="4819"/>
+        <w:gridCol w:w="4819"/>
+      </w:tblGrid>
+      <w:tr>
+        <w:tc>
+          <w:tcPr>
+            <w:tcW w:type="dxa" w:w="4819"/>
+            <w:shd w:fill="F7F7F5" w:val="clear"/>
+            <w:tcBorders>
+              <w:top w:val="single" w:sz="6" w:color="1A1A1A"/>
+              <w:left w:val="single" w:sz="6" w:color="1A1A1A"/>
+              <w:bottom w:val="single" w:sz="6" w:color="1A1A1A"/>
+              <w:right w:val="single" w:sz="6" w:color="1A1A1A"/>
+            </w:tcBorders>
+          </w:tcPr>
+          <w:p>
+            <w:r/>
+            <w:r>
+              <w:rPr>
+                <w:rFonts w:ascii="Times New Roman" w:hAnsi="Times New Roman" w:eastAsia="Times New Roman"/>
+                <w:b/>
+                <w:i w:val="0"/>
+                <w:sz w:val="20"/>
+              </w:rPr>
+              <w:t>Cenę netto:</w:t>
+            </w:r>
+          </w:p>
+        </w:tc>
+        <w:tc>
+          <w:tcPr>
+            <w:tcW w:type="dxa" w:w="4819"/>
+            <w:shd w:fill="F7F7F5" w:val="clear"/>
+            <w:tcBorders>
+              <w:top w:val="single" w:sz="6" w:color="1A1A1A"/>
+              <w:left w:val="single" w:sz="6" w:color="1A1A1A"/>
+              <w:bottom w:val="single" w:sz="6" w:color="1A1A1A"/>
+              <w:right w:val="single" w:sz="6" w:color="1A1A1A"/>
+            </w:tcBorders>
+          </w:tcPr>
+          <w:p>
+            <w:r/>
+            <w:r>
+              <w:rPr>
+                <w:rFonts w:ascii="Times New Roman" w:hAnsi="Times New Roman" w:eastAsia="Times New Roman"/>
+                <w:b/>
+                <w:i w:val="0"/>
+                <w:sz w:val="22"/>
+              </w:rPr>
+              <w:t>6 300,00 zł</w:t>
+            </w:r>
+          </w:p>
+        </w:tc>
+      </w:tr>
+      <w:tr>
+        <w:tc>
+          <w:tcPr>
+            <w:tcW w:type="dxa" w:w="4819"/>
+            <w:shd w:fill="F7F7F5" w:val="clear"/>
+            <w:tcBorders>
+              <w:top w:val="single" w:sz="6" w:color="1A1A1A"/>
+              <w:left w:val="single" w:sz="6" w:color="1A1A1A"/>
+              <w:bottom w:val="single" w:sz="6" w:color="1A1A1A"/>
+              <w:right w:val="single" w:sz="6" w:color="1A1A1A"/>
+            </w:tcBorders>
+          </w:tcPr>
+          <w:p>
+            <w:r/>
+            <w:r>
+              <w:rPr>
+                <w:rFonts w:ascii="Times New Roman" w:hAnsi="Times New Roman" w:eastAsia="Times New Roman"/>
+                <w:b/>
+                <w:i w:val="0"/>
+                <w:sz w:val="20"/>
+              </w:rPr>
+              <w:t>Słownie cenę netto:</w:t>
+            </w:r>
+          </w:p>
+        </w:tc>
+        <w:tc>
+          <w:tcPr>
+            <w:tcW w:type="dxa" w:w="4819"/>
+            <w:shd w:fill="F7F7F5" w:val="clear"/>
+            <w:tcBorders>
+              <w:top w:val="single" w:sz="6" w:color="1A1A1A"/>
+              <w:left w:val="single" w:sz="6" w:color="1A1A1A"/>
+              <w:bottom w:val="single" w:sz="6" w:color="1A1A1A"/>
+              <w:right w:val="single" w:sz="6" w:color="1A1A1A"/>
+            </w:tcBorders>
+          </w:tcPr>
+          <w:p>
+            <w:r/>
+            <w:r>
+              <w:rPr>
+                <w:rFonts w:ascii="Times New Roman" w:hAnsi="Times New Roman" w:eastAsia="Times New Roman"/>
+                <w:b w:val="0"/>
+                <w:i w:val="0"/>
+                <w:sz w:val="20"/>
+              </w:rPr>
+              <w:t>sześć tysięcy trzysta złotych 00/100</w:t>
+            </w:r>
+          </w:p>
+        </w:tc>
+      </w:tr>
+      <w:tr>
+        <w:tc>
+          <w:tcPr>
+            <w:tcW w:type="dxa" w:w="4819"/>
+            <w:shd w:fill="F7F7F5" w:val="clear"/>
+            <w:tcBorders>
+              <w:top w:val="single" w:sz="6" w:color="1A1A1A"/>
+              <w:left w:val="single" w:sz="6" w:color="1A1A1A"/>
+              <w:bottom w:val="single" w:sz="6" w:color="1A1A1A"/>
+              <w:right w:val="single" w:sz="6" w:color="1A1A1A"/>
+            </w:tcBorders>
+          </w:tcPr>
+          <w:p>
+            <w:r/>
+            <w:r>
+              <w:rPr>
+                <w:rFonts w:ascii="Times New Roman" w:hAnsi="Times New Roman" w:eastAsia="Times New Roman"/>
+                <w:b/>
+                <w:i w:val="0"/>
+                <w:sz w:val="20"/>
+              </w:rPr>
+              <w:t>Cenę brutto:</w:t>
+            </w:r>
+          </w:p>
+        </w:tc>
+        <w:tc>
+          <w:tcPr>
+            <w:tcW w:type="dxa" w:w="4819"/>
+            <w:shd w:fill="F7F7F5" w:val="clear"/>
+            <w:tcBorders>
+              <w:top w:val="single" w:sz="6" w:color="1A1A1A"/>
+              <w:left w:val="single" w:sz="6" w:color="1A1A1A"/>
+              <w:bottom w:val="single" w:sz="6" w:color="1A1A1A"/>
+              <w:right w:val="single" w:sz="6" w:color="1A1A1A"/>
+            </w:tcBorders>
+          </w:tcPr>
+          <w:p>
+            <w:r/>
+            <w:r>
+              <w:rPr>
+                <w:rFonts w:ascii="Times New Roman" w:hAnsi="Times New Roman" w:eastAsia="Times New Roman"/>
+                <w:b/>
+                <w:i w:val="0"/>
+                <w:sz w:val="22"/>
+              </w:rPr>
+              <w:t>7 749,00 zł</w:t>
+            </w:r>
+          </w:p>
+        </w:tc>
+      </w:tr>
+      <w:tr>
+        <w:tc>
+          <w:tcPr>
+            <w:tcW w:type="dxa" w:w="4819"/>
+            <w:shd w:fill="F7F7F5" w:val="clear"/>
+            <w:tcBorders>
+              <w:top w:val="single" w:sz="6" w:color="1A1A1A"/>
+              <w:left w:val="single" w:sz="6" w:color="1A1A1A"/>
+              <w:bottom w:val="single" w:sz="6" w:color="1A1A1A"/>
+              <w:right w:val="single" w:sz="6" w:color="1A1A1A"/>
+            </w:tcBorders>
+          </w:tcPr>
+          <w:p>
+            <w:r/>
+            <w:r>
+              <w:rPr>
+                <w:rFonts w:ascii="Times New Roman" w:hAnsi="Times New Roman" w:eastAsia="Times New Roman"/>
+                <w:b/>
+                <w:i w:val="0"/>
+                <w:sz w:val="20"/>
+              </w:rPr>
+              <w:t>Słownie brutto:</w:t>
+            </w:r>
+          </w:p>
+        </w:tc>
+        <w:tc>
+          <w:tcPr>
+            <w:tcW w:type="dxa" w:w="4819"/>
+            <w:shd w:fill="F7F7F5" w:val="clear"/>
+            <w:tcBorders>
+              <w:top w:val="single" w:sz="6" w:color="1A1A1A"/>
+              <w:left w:val="single" w:sz="6" w:color="1A1A1A"/>
+              <w:bottom w:val="single" w:sz="6" w:color="1A1A1A"/>
+              <w:right w:val="single" w:sz="6" w:color="1A1A1A"/>
+            </w:tcBorders>
+          </w:tcPr>
+          <w:p>
+            <w:r/>
+            <w:r>
+              <w:rPr>
+                <w:rFonts w:ascii="Times New Roman" w:hAnsi="Times New Roman" w:eastAsia="Times New Roman"/>
+                <w:b w:val="0"/>
+                <w:i w:val="0"/>
+                <w:sz w:val="20"/>
+              </w:rPr>
+              <w:t>siedem tysięcy siedemset czterdzieści dziewięć złotych 00/100</w:t>
+            </w:r>
+          </w:p>
+        </w:tc>
+      </w:tr>
+      <w:tr>
+        <w:tc>
+          <w:tcPr>
+            <w:tcW w:type="dxa" w:w="4819"/>
+            <w:shd w:fill="F7F7F5" w:val="clear"/>
+            <w:tcBorders>
+              <w:top w:val="single" w:sz="6" w:color="1A1A1A"/>
+              <w:left w:val="single" w:sz="6" w:color="1A1A1A"/>
+              <w:bottom w:val="single" w:sz="6" w:color="1A1A1A"/>
+              <w:right w:val="single" w:sz="6" w:color="1A1A1A"/>
+            </w:tcBorders>
+          </w:tcPr>
+          <w:p>
+            <w:r/>
+            <w:r>
+              <w:rPr>
+                <w:rFonts w:ascii="Times New Roman" w:hAnsi="Times New Roman" w:eastAsia="Times New Roman"/>
+                <w:b/>
+                <w:i w:val="0"/>
+                <w:sz w:val="20"/>
+              </w:rPr>
+              <w:t>Kalkulacja:</w:t>
+            </w:r>
+          </w:p>
+        </w:tc>
+        <w:tc>
+          <w:tcPr>
+            <w:tcW w:type="dxa" w:w="4819"/>
+            <w:shd w:fill="F7F7F5" w:val="clear"/>
+            <w:tcBorders>
+              <w:top w:val="single" w:sz="6" w:color="1A1A1A"/>
+              <w:left w:val="single" w:sz="6" w:color="1A1A1A"/>
+              <w:bottom w:val="single" w:sz="6" w:color="1A1A1A"/>
+              <w:right w:val="single" w:sz="6" w:color="1A1A1A"/>
+            </w:tcBorders>
+          </w:tcPr>
+          <w:p>
+            <w:r/>
+            <w:r>
+              <w:rPr>
+                <w:rFonts w:ascii="Times New Roman" w:hAnsi="Times New Roman" w:eastAsia="Times New Roman"/>
+                <w:b w:val="0"/>
+                <w:i w:val="0"/>
+                <w:sz w:val="20"/>
+              </w:rPr>
+              <w:t>15 szt. × 420,00 zł netto/szt. (WP5-2 z materacem) · VAT 23% · 516,60 zł brutto/szt.</w:t>
+            </w:r>
+          </w:p>
+        </w:tc>
+      </w:tr>
+    </w:tbl>
     <w:p>
       <w:pPr>
         <w:spacing w:after="160" w:before="0"/>
+        <w:jc w:val="left"/>
       </w:pPr>
-      <w:r>
-        <w:rPr>
-          <w:rFonts w:ascii="Times New Roman" w:hAnsi="Times New Roman" w:eastAsia="Times New Roman"/>
-          <w:b/>
-          <w:i w:val="0"/>
-          <w:sz w:val="22"/>
-        </w:rPr>
-        <w:t xml:space="preserve">Słownie cenę netto: </w:t>
-      </w:r>
-      <w:r>
-        <w:rPr>
-          <w:rFonts w:ascii="Times New Roman" w:hAnsi="Times New Roman" w:eastAsia="Times New Roman"/>
-          <w:b w:val="0"/>
-          <w:i w:val="0"/>
-          <w:sz w:val="22"/>
-        </w:rPr>
-        <w:t>sześć tysięcy trzysta złotych 00/100</w:t>
-      </w:r>
-    </w:p>
-    <w:p>
-      <w:pPr>
-        <w:spacing w:after="80" w:before="0"/>
-      </w:pPr>
-      <w:r>
-        <w:rPr>
-          <w:rFonts w:ascii="Times New Roman" w:hAnsi="Times New Roman" w:eastAsia="Times New Roman"/>
-          <w:b/>
-          <w:i w:val="0"/>
-          <w:sz w:val="22"/>
-        </w:rPr>
-        <w:t xml:space="preserve">Cenę brutto: </w:t>
-      </w:r>
-      <w:r>
-        <w:rPr>
-          <w:rFonts w:ascii="Times New Roman" w:hAnsi="Times New Roman" w:eastAsia="Times New Roman"/>
-          <w:b/>
-          <w:i w:val="0"/>
-          <w:sz w:val="24"/>
-        </w:rPr>
-        <w:t>7 749,00 zł</w:t>
-      </w:r>
-    </w:p>
-    <w:p>
-      <w:pPr>
-        <w:spacing w:after="160" w:before="0"/>
-      </w:pPr>
-      <w:r>
-        <w:rPr>
-          <w:rFonts w:ascii="Times New Roman" w:hAnsi="Times New Roman" w:eastAsia="Times New Roman"/>
-          <w:b/>
-          <w:i w:val="0"/>
-          <w:sz w:val="22"/>
-        </w:rPr>
-        <w:t xml:space="preserve">Słownie brutto: </w:t>
-      </w:r>
-      <w:r>
-        <w:rPr>
-          <w:rFonts w:ascii="Times New Roman" w:hAnsi="Times New Roman" w:eastAsia="Times New Roman"/>
-          <w:b w:val="0"/>
-          <w:i w:val="0"/>
-          <w:sz w:val="22"/>
-        </w:rPr>
-        <w:t>siedem tysięcy siedemset czterdzieści dziewięć złotych 00/100</w:t>
-      </w:r>
     </w:p>
     <w:p>
       <w:pPr>
         <w:spacing w:after="120" w:before="0"/>
+        <w:jc w:val="left"/>
       </w:pPr>
       <w:r>
         <w:rPr>
@@ -415,7 +592,7 @@
     </w:p>
     <w:p>
       <w:pPr>
-        <w:spacing w:after="200" w:before="0"/>
+        <w:spacing w:after="160" w:before="0"/>
         <w:jc w:val="both"/>
       </w:pPr>
       <w:r>
@@ -439,35 +616,8 @@
     </w:p>
     <w:p>
       <w:pPr>
-        <w:spacing w:after="40" w:before="0"/>
-      </w:pPr>
-      <w:r>
-        <w:rPr>
-          <w:rFonts w:ascii="Times New Roman" w:hAnsi="Times New Roman" w:eastAsia="Times New Roman"/>
-          <w:b/>
-          <w:i w:val="0"/>
-          <w:sz w:val="20"/>
-        </w:rPr>
-        <w:t>Kalkulacja (informacyjnie):</w:t>
-      </w:r>
-    </w:p>
-    <w:p>
-      <w:pPr>
-        <w:spacing w:after="240" w:before="0"/>
-      </w:pPr>
-      <w:r>
-        <w:rPr>
-          <w:rFonts w:ascii="Times New Roman" w:hAnsi="Times New Roman" w:eastAsia="Times New Roman"/>
-          <w:b w:val="0"/>
-          <w:i/>
-          <w:sz w:val="18"/>
-        </w:rPr>
-        <w:t>15 szt. × 420,00 zł netto/szt. (łóżko polowe WP5-2 z materacem) = 6 300,00 zł netto; VAT 23% = 1 449,00 zł; brutto = 7 749,00 zł (516,60 zł brutto/szt.).</w:t>
-      </w:r>
-    </w:p>
-    <w:p>
-      <w:pPr>
-        <w:spacing w:after="160" w:before="0"/>
+        <w:spacing w:after="120" w:before="0"/>
+        <w:jc w:val="left"/>
       </w:pPr>
       <w:r>
         <w:rPr>
@@ -494,12 +644,12 @@
           <w:i w:val="0"/>
           <w:sz w:val="22"/>
         </w:rPr>
-        <w:t xml:space="preserve"> / nie jestem ** płatnikiem podatku VAT.</w:t>
+        <w:t xml:space="preserve"> / nie jestem** płatnikiem podatku VAT.</w:t>
       </w:r>
     </w:p>
     <w:p>
       <w:pPr>
-        <w:spacing w:after="120" w:before="0"/>
+        <w:spacing w:after="80" w:before="0"/>
         <w:jc w:val="both"/>
       </w:pPr>
       <w:r>
@@ -532,21 +682,38 @@
     </w:p>
     <w:p>
       <w:pPr>
-        <w:spacing w:after="40" w:before="0"/>
+        <w:spacing w:after="120" w:before="0"/>
+        <w:jc w:val="left"/>
+      </w:pPr>
+      <w:r>
+        <w:rPr>
+          <w:rFonts w:ascii="Times New Roman" w:hAnsi="Times New Roman" w:eastAsia="Times New Roman"/>
+          <w:b/>
+          <w:i w:val="0"/>
+          <w:sz w:val="18"/>
+        </w:rPr>
+        <w:t>(właściwe: nie będzie)</w:t>
+      </w:r>
+    </w:p>
+    <w:p>
+      <w:pPr>
+        <w:spacing w:after="20" w:before="0"/>
+        <w:jc w:val="left"/>
       </w:pPr>
       <w:r>
         <w:rPr>
           <w:rFonts w:ascii="Times New Roman" w:hAnsi="Times New Roman" w:eastAsia="Times New Roman"/>
           <w:b w:val="0"/>
           <w:i w:val="0"/>
-          <w:sz w:val="20"/>
+          <w:sz w:val="18"/>
         </w:rPr>
         <w:t>Nazwa towaru lub usługi, których świadczenie będzie prowadzić do powstania obowiązku podatkowego po stronie Zamawiającego:</w:t>
       </w:r>
     </w:p>
     <w:p>
       <w:pPr>
-        <w:spacing w:after="120" w:before="0"/>
+        <w:spacing w:after="80" w:before="0"/>
+        <w:jc w:val="left"/>
       </w:pPr>
       <w:r>
         <w:rPr>
@@ -560,21 +727,23 @@
     </w:p>
     <w:p>
       <w:pPr>
-        <w:spacing w:after="40" w:before="0"/>
+        <w:spacing w:after="20" w:before="0"/>
+        <w:jc w:val="left"/>
       </w:pPr>
       <w:r>
         <w:rPr>
           <w:rFonts w:ascii="Times New Roman" w:hAnsi="Times New Roman" w:eastAsia="Times New Roman"/>
           <w:b w:val="0"/>
           <w:i w:val="0"/>
-          <w:sz w:val="20"/>
+          <w:sz w:val="18"/>
         </w:rPr>
         <w:t>Wartość tego towaru lub usługi bez kwoty podatku:</w:t>
       </w:r>
     </w:p>
     <w:p>
       <w:pPr>
-        <w:spacing w:after="200" w:before="0"/>
+        <w:spacing w:after="160" w:before="0"/>
+        <w:jc w:val="left"/>
       </w:pPr>
       <w:r>
         <w:rPr>
@@ -588,7 +757,7 @@
     </w:p>
     <w:p>
       <w:pPr>
-        <w:spacing w:after="200" w:before="0"/>
+        <w:spacing w:after="160" w:before="0"/>
         <w:jc w:val="both"/>
       </w:pPr>
       <w:r>
@@ -596,14 +765,15 @@
           <w:rFonts w:ascii="Times New Roman" w:hAnsi="Times New Roman" w:eastAsia="Times New Roman"/>
           <w:b w:val="0"/>
           <w:i w:val="0"/>
-          <w:sz w:val="22"/>
+          <w:sz w:val="20"/>
         </w:rPr>
         <w:t>Oświadczam, że zapoznałem/am się ze szczegółowym opisem przedmiotu zamówienia i nie wnoszę do niego zastrzeżeń oraz uzyskaliśmy informacje niezbędne do przygotowania oferty.</w:t>
       </w:r>
     </w:p>
     <w:p>
       <w:pPr>
-        <w:spacing w:after="80" w:before="0"/>
+        <w:spacing w:after="60" w:before="0"/>
+        <w:jc w:val="left"/>
       </w:pPr>
       <w:r>
         <w:rPr>
@@ -617,14 +787,15 @@
     </w:p>
     <w:p>
       <w:pPr>
-        <w:spacing w:after="40" w:before="0"/>
+        <w:spacing w:after="20" w:before="0"/>
+        <w:jc w:val="left"/>
       </w:pPr>
       <w:r>
         <w:rPr>
           <w:rFonts w:ascii="Times New Roman" w:hAnsi="Times New Roman" w:eastAsia="Times New Roman"/>
           <w:b w:val="0"/>
           <w:i w:val="0"/>
-          <w:sz w:val="22"/>
+          <w:sz w:val="20"/>
         </w:rPr>
         <w:t>1. Specyfikacja oferowanego łóżka polowego WP5-2 z materacem (zgodność z wymaganiami technicznymi).</w:t>
       </w:r>
@@ -632,15 +803,16 @@
     <w:p>
       <w:pPr>
         <w:spacing w:after="280" w:before="0"/>
+        <w:jc w:val="left"/>
       </w:pPr>
       <w:r>
         <w:rPr>
           <w:rFonts w:ascii="Times New Roman" w:hAnsi="Times New Roman" w:eastAsia="Times New Roman"/>
           <w:b w:val="0"/>
           <w:i w:val="0"/>
-          <w:sz w:val="22"/>
+          <w:sz w:val="20"/>
         </w:rPr>
-        <w:t>2. Karta katalogowa / opis produktu WP5-2.</w:t>
+        <w:t>2. Karta katalogowa / opis produktu WP5-2 (producent: P.P.U.H. M-ELEKTROSTATYK).</w:t>
       </w:r>
     </w:p>
     <w:tbl>
@@ -649,13 +821,13 @@
         <w:tblLook w:firstColumn="1" w:firstRow="1" w:lastColumn="0" w:lastRow="0" w:noHBand="0" w:noVBand="1" w:val="04A0"/>
       </w:tblPr>
       <w:tblGrid>
-        <w:gridCol w:w="4986"/>
-        <w:gridCol w:w="4986"/>
+        <w:gridCol w:w="4819"/>
+        <w:gridCol w:w="4819"/>
       </w:tblGrid>
       <w:tr>
         <w:tc>
           <w:tcPr>
-            <w:tcW w:type="dxa" w:w="4986"/>
+            <w:tcW w:type="dxa" w:w="4819"/>
           </w:tcPr>
           <w:p>
             <w:r>
@@ -671,7 +843,7 @@
         </w:tc>
         <w:tc>
           <w:tcPr>
-            <w:tcW w:type="dxa" w:w="4986"/>
+            <w:tcW w:type="dxa" w:w="4819"/>
           </w:tcPr>
           <w:p>
             <w:pPr>
@@ -702,7 +874,7 @@
             <w:r>
               <w:rPr>
                 <w:rFonts w:ascii="Times New Roman" w:hAnsi="Times New Roman" w:eastAsia="Times New Roman"/>
-                <w:b w:val="0"/>
+                <w:b/>
                 <w:i w:val="0"/>
                 <w:sz w:val="20"/>
               </w:rPr>
@@ -714,12 +886,14 @@
     </w:tbl>
     <w:p>
       <w:pPr>
-        <w:spacing w:after="320" w:before="0"/>
+        <w:spacing w:after="240" w:before="0"/>
+        <w:jc w:val="left"/>
       </w:pPr>
     </w:p>
     <w:p>
       <w:pPr>
-        <w:spacing w:after="80" w:before="0"/>
+        <w:spacing w:after="40" w:before="0"/>
+        <w:jc w:val="left"/>
       </w:pPr>
       <w:r>
         <w:rPr>
@@ -733,7 +907,8 @@
     </w:p>
     <w:p>
       <w:pPr>
-        <w:spacing w:after="80" w:before="0"/>
+        <w:spacing w:after="40" w:before="0"/>
+        <w:jc w:val="left"/>
       </w:pPr>
       <w:r>
         <w:rPr>
@@ -745,9 +920,1194 @@
         <w:t>** Niepotrzebne skreślić.</w:t>
       </w:r>
     </w:p>
+    <w:p>
+      <w:r>
+        <w:br w:type="page"/>
+      </w:r>
+    </w:p>
+    <w:p>
+      <w:pPr>
+        <w:spacing w:after="160" w:before="0"/>
+        <w:jc w:val="right"/>
+      </w:pPr>
+      <w:r>
+        <w:rPr>
+          <w:rFonts w:ascii="Times New Roman" w:hAnsi="Times New Roman" w:eastAsia="Times New Roman"/>
+          <w:b/>
+          <w:i w:val="0"/>
+          <w:sz w:val="18"/>
+        </w:rPr>
+        <w:t>Załącznik nr 1 do oferty — USCiSO.2151.13.2026</w:t>
+      </w:r>
+    </w:p>
+    <w:p>
+      <w:pPr>
+        <w:spacing w:after="40" w:before="0"/>
+        <w:jc w:val="center"/>
+      </w:pPr>
+      <w:r>
+        <w:rPr>
+          <w:rFonts w:ascii="Times New Roman" w:hAnsi="Times New Roman" w:eastAsia="Times New Roman"/>
+          <w:b/>
+          <w:i w:val="0"/>
+          <w:sz w:val="28"/>
+        </w:rPr>
+        <w:t>SPECYFIKACJA OFEROWANEGO ASORTYMENTU</w:t>
+      </w:r>
+    </w:p>
+    <w:p>
+      <w:pPr>
+        <w:spacing w:after="160" w:before="0"/>
+        <w:jc w:val="center"/>
+      </w:pPr>
+      <w:r>
+        <w:rPr>
+          <w:rFonts w:ascii="Times New Roman" w:hAnsi="Times New Roman" w:eastAsia="Times New Roman"/>
+          <w:b w:val="0"/>
+          <w:i w:val="0"/>
+          <w:sz w:val="22"/>
+        </w:rPr>
+        <w:t>Łóżko polowe WP5-2 z materacem — 15 szt.</w:t>
+      </w:r>
+    </w:p>
+    <w:p>
+      <w:pPr>
+        <w:spacing w:after="200" w:before="0"/>
+        <w:jc w:val="both"/>
+      </w:pPr>
+      <w:r>
+        <w:rPr>
+          <w:rFonts w:ascii="Times New Roman" w:hAnsi="Times New Roman" w:eastAsia="Times New Roman"/>
+          <w:b w:val="0"/>
+          <w:i w:val="0"/>
+          <w:sz w:val="20"/>
+        </w:rPr>
+        <w:t>Oferujemy łóżko polowe typu WP5-2 z materacem (producent: P.P.U.H. M-ELEKTROSTATYK) — model kwaterunkowo-polowy przeznaczony m.in. dla służb mundurowych oraz sztabów zarządzania kryzysowego. Stelaż ze stalowej rury fi 22, 5-stopniowa regulacja oparcia, materac wodoodporny z pianką, atesty PZH.</w:t>
+      </w:r>
+    </w:p>
+    <w:p>
+      <w:pPr>
+        <w:spacing w:after="120" w:before="0"/>
+        <w:jc w:val="left"/>
+      </w:pPr>
+      <w:r>
+        <w:rPr>
+          <w:rFonts w:ascii="Times New Roman" w:hAnsi="Times New Roman" w:eastAsia="Times New Roman"/>
+          <w:b/>
+          <w:i w:val="0"/>
+          <w:sz w:val="22"/>
+        </w:rPr>
+        <w:t>Zgodność z wymaganiami technicznymi Zamawiającego</w:t>
+      </w:r>
+    </w:p>
+    <w:tbl>
+      <w:tblPr>
+        <w:tblStyle w:val="TableGrid"/>
+        <w:tblW w:type="auto" w:w="0"/>
+        <w:tblLayout w:type="autofit"/>
+        <w:tblLook w:firstColumn="1" w:firstRow="1" w:lastColumn="0" w:lastRow="0" w:noHBand="0" w:noVBand="1" w:val="04A0"/>
+      </w:tblPr>
+      <w:tblGrid>
+        <w:gridCol w:w="2409"/>
+        <w:gridCol w:w="2409"/>
+        <w:gridCol w:w="2409"/>
+        <w:gridCol w:w="2409"/>
+      </w:tblGrid>
+      <w:tr>
+        <w:tc>
+          <w:tcPr>
+            <w:tcW w:type="dxa" w:w="2409"/>
+            <w:shd w:fill="2C2C2C" w:val="clear"/>
+          </w:tcPr>
+          <w:p>
+            <w:r/>
+            <w:r>
+              <w:rPr>
+                <w:rFonts w:ascii="Times New Roman" w:hAnsi="Times New Roman" w:eastAsia="Times New Roman"/>
+                <w:b/>
+                <w:i w:val="0"/>
+                <w:color w:val="FFFFFF"/>
+                <w:sz w:val="18"/>
+              </w:rPr>
+              <w:t>Wymaganie</w:t>
+            </w:r>
+          </w:p>
+        </w:tc>
+        <w:tc>
+          <w:tcPr>
+            <w:tcW w:type="dxa" w:w="2409"/>
+            <w:shd w:fill="2C2C2C" w:val="clear"/>
+          </w:tcPr>
+          <w:p>
+            <w:r/>
+            <w:r>
+              <w:rPr>
+                <w:rFonts w:ascii="Times New Roman" w:hAnsi="Times New Roman" w:eastAsia="Times New Roman"/>
+                <w:b/>
+                <w:i w:val="0"/>
+                <w:color w:val="FFFFFF"/>
+                <w:sz w:val="18"/>
+              </w:rPr>
+              <w:t>Wartość wymagana</w:t>
+            </w:r>
+          </w:p>
+        </w:tc>
+        <w:tc>
+          <w:tcPr>
+            <w:tcW w:type="dxa" w:w="2409"/>
+            <w:shd w:fill="2C2C2C" w:val="clear"/>
+          </w:tcPr>
+          <w:p>
+            <w:r/>
+            <w:r>
+              <w:rPr>
+                <w:rFonts w:ascii="Times New Roman" w:hAnsi="Times New Roman" w:eastAsia="Times New Roman"/>
+                <w:b/>
+                <w:i w:val="0"/>
+                <w:color w:val="FFFFFF"/>
+                <w:sz w:val="18"/>
+              </w:rPr>
+              <w:t>Oferowane WP5-2</w:t>
+            </w:r>
+          </w:p>
+        </w:tc>
+        <w:tc>
+          <w:tcPr>
+            <w:tcW w:type="dxa" w:w="2409"/>
+            <w:shd w:fill="2C2C2C" w:val="clear"/>
+          </w:tcPr>
+          <w:p>
+            <w:r/>
+            <w:r>
+              <w:rPr>
+                <w:rFonts w:ascii="Times New Roman" w:hAnsi="Times New Roman" w:eastAsia="Times New Roman"/>
+                <w:b/>
+                <w:i w:val="0"/>
+                <w:color w:val="FFFFFF"/>
+                <w:sz w:val="18"/>
+              </w:rPr>
+              <w:t>Ocena</w:t>
+            </w:r>
+          </w:p>
+        </w:tc>
+      </w:tr>
+      <w:tr>
+        <w:tc>
+          <w:tcPr>
+            <w:tcW w:type="dxa" w:w="2409"/>
+            <w:shd w:fill="F3F3F0" w:val="clear"/>
+          </w:tcPr>
+          <w:p>
+            <w:r/>
+            <w:r>
+              <w:rPr>
+                <w:rFonts w:ascii="Times New Roman" w:hAnsi="Times New Roman" w:eastAsia="Times New Roman"/>
+                <w:b w:val="0"/>
+                <w:i w:val="0"/>
+                <w:sz w:val="16"/>
+              </w:rPr>
+              <w:t>Długość</w:t>
+            </w:r>
+          </w:p>
+        </w:tc>
+        <w:tc>
+          <w:tcPr>
+            <w:tcW w:type="dxa" w:w="2409"/>
+            <w:shd w:fill="F3F3F0" w:val="clear"/>
+          </w:tcPr>
+          <w:p>
+            <w:r/>
+            <w:r>
+              <w:rPr>
+                <w:rFonts w:ascii="Times New Roman" w:hAnsi="Times New Roman" w:eastAsia="Times New Roman"/>
+                <w:b w:val="0"/>
+                <w:i w:val="0"/>
+                <w:sz w:val="16"/>
+              </w:rPr>
+              <w:t>190–213 cm</w:t>
+            </w:r>
+          </w:p>
+        </w:tc>
+        <w:tc>
+          <w:tcPr>
+            <w:tcW w:type="dxa" w:w="2409"/>
+            <w:shd w:fill="F3F3F0" w:val="clear"/>
+          </w:tcPr>
+          <w:p>
+            <w:r/>
+            <w:r>
+              <w:rPr>
+                <w:rFonts w:ascii="Times New Roman" w:hAnsi="Times New Roman" w:eastAsia="Times New Roman"/>
+                <w:b w:val="0"/>
+                <w:i w:val="0"/>
+                <w:sz w:val="16"/>
+              </w:rPr>
+              <w:t>205 cm</w:t>
+            </w:r>
+          </w:p>
+        </w:tc>
+        <w:tc>
+          <w:tcPr>
+            <w:tcW w:type="dxa" w:w="2409"/>
+            <w:shd w:fill="F3F3F0" w:val="clear"/>
+          </w:tcPr>
+          <w:p>
+            <w:r/>
+            <w:r>
+              <w:rPr>
+                <w:rFonts w:ascii="Times New Roman" w:hAnsi="Times New Roman" w:eastAsia="Times New Roman"/>
+                <w:b/>
+                <w:i w:val="0"/>
+                <w:sz w:val="16"/>
+              </w:rPr>
+              <w:t>TAK</w:t>
+            </w:r>
+          </w:p>
+        </w:tc>
+      </w:tr>
+      <w:tr>
+        <w:tc>
+          <w:tcPr>
+            <w:tcW w:type="dxa" w:w="2409"/>
+          </w:tcPr>
+          <w:p>
+            <w:r/>
+            <w:r>
+              <w:rPr>
+                <w:rFonts w:ascii="Times New Roman" w:hAnsi="Times New Roman" w:eastAsia="Times New Roman"/>
+                <w:b w:val="0"/>
+                <w:i w:val="0"/>
+                <w:sz w:val="16"/>
+              </w:rPr>
+              <w:t>Szerokość</w:t>
+            </w:r>
+          </w:p>
+        </w:tc>
+        <w:tc>
+          <w:tcPr>
+            <w:tcW w:type="dxa" w:w="2409"/>
+          </w:tcPr>
+          <w:p>
+            <w:r/>
+            <w:r>
+              <w:rPr>
+                <w:rFonts w:ascii="Times New Roman" w:hAnsi="Times New Roman" w:eastAsia="Times New Roman"/>
+                <w:b w:val="0"/>
+                <w:i w:val="0"/>
+                <w:sz w:val="16"/>
+              </w:rPr>
+              <w:t>60–80/90 cm</w:t>
+            </w:r>
+          </w:p>
+        </w:tc>
+        <w:tc>
+          <w:tcPr>
+            <w:tcW w:type="dxa" w:w="2409"/>
+          </w:tcPr>
+          <w:p>
+            <w:r/>
+            <w:r>
+              <w:rPr>
+                <w:rFonts w:ascii="Times New Roman" w:hAnsi="Times New Roman" w:eastAsia="Times New Roman"/>
+                <w:b w:val="0"/>
+                <w:i w:val="0"/>
+                <w:sz w:val="16"/>
+              </w:rPr>
+              <w:t>70 cm</w:t>
+            </w:r>
+          </w:p>
+        </w:tc>
+        <w:tc>
+          <w:tcPr>
+            <w:tcW w:type="dxa" w:w="2409"/>
+          </w:tcPr>
+          <w:p>
+            <w:r/>
+            <w:r>
+              <w:rPr>
+                <w:rFonts w:ascii="Times New Roman" w:hAnsi="Times New Roman" w:eastAsia="Times New Roman"/>
+                <w:b/>
+                <w:i w:val="0"/>
+                <w:sz w:val="16"/>
+              </w:rPr>
+              <w:t>TAK</w:t>
+            </w:r>
+          </w:p>
+        </w:tc>
+      </w:tr>
+      <w:tr>
+        <w:tc>
+          <w:tcPr>
+            <w:tcW w:type="dxa" w:w="2409"/>
+            <w:shd w:fill="F3F3F0" w:val="clear"/>
+          </w:tcPr>
+          <w:p>
+            <w:r/>
+            <w:r>
+              <w:rPr>
+                <w:rFonts w:ascii="Times New Roman" w:hAnsi="Times New Roman" w:eastAsia="Times New Roman"/>
+                <w:b w:val="0"/>
+                <w:i w:val="0"/>
+                <w:sz w:val="16"/>
+              </w:rPr>
+              <w:t>Wysokość po rozłożeniu</w:t>
+            </w:r>
+          </w:p>
+        </w:tc>
+        <w:tc>
+          <w:tcPr>
+            <w:tcW w:type="dxa" w:w="2409"/>
+            <w:shd w:fill="F3F3F0" w:val="clear"/>
+          </w:tcPr>
+          <w:p>
+            <w:r/>
+            <w:r>
+              <w:rPr>
+                <w:rFonts w:ascii="Times New Roman" w:hAnsi="Times New Roman" w:eastAsia="Times New Roman"/>
+                <w:b w:val="0"/>
+                <w:i w:val="0"/>
+                <w:sz w:val="16"/>
+              </w:rPr>
+              <w:t>ok. 30–45 cm</w:t>
+            </w:r>
+          </w:p>
+        </w:tc>
+        <w:tc>
+          <w:tcPr>
+            <w:tcW w:type="dxa" w:w="2409"/>
+            <w:shd w:fill="F3F3F0" w:val="clear"/>
+          </w:tcPr>
+          <w:p>
+            <w:r/>
+            <w:r>
+              <w:rPr>
+                <w:rFonts w:ascii="Times New Roman" w:hAnsi="Times New Roman" w:eastAsia="Times New Roman"/>
+                <w:b w:val="0"/>
+                <w:i w:val="0"/>
+                <w:sz w:val="16"/>
+              </w:rPr>
+              <w:t>ok. 30–35 cm*</w:t>
+            </w:r>
+          </w:p>
+        </w:tc>
+        <w:tc>
+          <w:tcPr>
+            <w:tcW w:type="dxa" w:w="2409"/>
+            <w:shd w:fill="F3F3F0" w:val="clear"/>
+          </w:tcPr>
+          <w:p>
+            <w:r/>
+            <w:r>
+              <w:rPr>
+                <w:rFonts w:ascii="Times New Roman" w:hAnsi="Times New Roman" w:eastAsia="Times New Roman"/>
+                <w:b/>
+                <w:i w:val="0"/>
+                <w:sz w:val="16"/>
+              </w:rPr>
+              <w:t>TAK</w:t>
+            </w:r>
+          </w:p>
+        </w:tc>
+      </w:tr>
+      <w:tr>
+        <w:tc>
+          <w:tcPr>
+            <w:tcW w:type="dxa" w:w="2409"/>
+          </w:tcPr>
+          <w:p>
+            <w:r/>
+            <w:r>
+              <w:rPr>
+                <w:rFonts w:ascii="Times New Roman" w:hAnsi="Times New Roman" w:eastAsia="Times New Roman"/>
+                <w:b w:val="0"/>
+                <w:i w:val="0"/>
+                <w:sz w:val="16"/>
+              </w:rPr>
+              <w:t>Wymiary po złożeniu</w:t>
+            </w:r>
+          </w:p>
+        </w:tc>
+        <w:tc>
+          <w:tcPr>
+            <w:tcW w:type="dxa" w:w="2409"/>
+          </w:tcPr>
+          <w:p>
+            <w:r/>
+            <w:r>
+              <w:rPr>
+                <w:rFonts w:ascii="Times New Roman" w:hAnsi="Times New Roman" w:eastAsia="Times New Roman"/>
+                <w:b w:val="0"/>
+                <w:i w:val="0"/>
+                <w:sz w:val="16"/>
+              </w:rPr>
+              <w:t>ok. 82×62×14 lub 85×72×17</w:t>
+            </w:r>
+          </w:p>
+        </w:tc>
+        <w:tc>
+          <w:tcPr>
+            <w:tcW w:type="dxa" w:w="2409"/>
+          </w:tcPr>
+          <w:p>
+            <w:r/>
+            <w:r>
+              <w:rPr>
+                <w:rFonts w:ascii="Times New Roman" w:hAnsi="Times New Roman" w:eastAsia="Times New Roman"/>
+                <w:b w:val="0"/>
+                <w:i w:val="0"/>
+                <w:sz w:val="16"/>
+              </w:rPr>
+              <w:t>ok. 85×70×15 cm</w:t>
+            </w:r>
+          </w:p>
+        </w:tc>
+        <w:tc>
+          <w:tcPr>
+            <w:tcW w:type="dxa" w:w="2409"/>
+          </w:tcPr>
+          <w:p>
+            <w:r/>
+            <w:r>
+              <w:rPr>
+                <w:rFonts w:ascii="Times New Roman" w:hAnsi="Times New Roman" w:eastAsia="Times New Roman"/>
+                <w:b/>
+                <w:i w:val="0"/>
+                <w:sz w:val="16"/>
+              </w:rPr>
+              <w:t>TAK**</w:t>
+            </w:r>
+          </w:p>
+        </w:tc>
+      </w:tr>
+      <w:tr>
+        <w:tc>
+          <w:tcPr>
+            <w:tcW w:type="dxa" w:w="2409"/>
+            <w:shd w:fill="F3F3F0" w:val="clear"/>
+          </w:tcPr>
+          <w:p>
+            <w:r/>
+            <w:r>
+              <w:rPr>
+                <w:rFonts w:ascii="Times New Roman" w:hAnsi="Times New Roman" w:eastAsia="Times New Roman"/>
+                <w:b w:val="0"/>
+                <w:i w:val="0"/>
+                <w:sz w:val="16"/>
+              </w:rPr>
+              <w:t>Udźwig</w:t>
+            </w:r>
+          </w:p>
+        </w:tc>
+        <w:tc>
+          <w:tcPr>
+            <w:tcW w:type="dxa" w:w="2409"/>
+            <w:shd w:fill="F3F3F0" w:val="clear"/>
+          </w:tcPr>
+          <w:p>
+            <w:r/>
+            <w:r>
+              <w:rPr>
+                <w:rFonts w:ascii="Times New Roman" w:hAnsi="Times New Roman" w:eastAsia="Times New Roman"/>
+                <w:b w:val="0"/>
+                <w:i w:val="0"/>
+                <w:sz w:val="16"/>
+              </w:rPr>
+              <w:t>120–150 kg</w:t>
+            </w:r>
+          </w:p>
+        </w:tc>
+        <w:tc>
+          <w:tcPr>
+            <w:tcW w:type="dxa" w:w="2409"/>
+            <w:shd w:fill="F3F3F0" w:val="clear"/>
+          </w:tcPr>
+          <w:p>
+            <w:r/>
+            <w:r>
+              <w:rPr>
+                <w:rFonts w:ascii="Times New Roman" w:hAnsi="Times New Roman" w:eastAsia="Times New Roman"/>
+                <w:b w:val="0"/>
+                <w:i w:val="0"/>
+                <w:sz w:val="16"/>
+              </w:rPr>
+              <w:t>150 kg</w:t>
+            </w:r>
+          </w:p>
+        </w:tc>
+        <w:tc>
+          <w:tcPr>
+            <w:tcW w:type="dxa" w:w="2409"/>
+            <w:shd w:fill="F3F3F0" w:val="clear"/>
+          </w:tcPr>
+          <w:p>
+            <w:r/>
+            <w:r>
+              <w:rPr>
+                <w:rFonts w:ascii="Times New Roman" w:hAnsi="Times New Roman" w:eastAsia="Times New Roman"/>
+                <w:b/>
+                <w:i w:val="0"/>
+                <w:sz w:val="16"/>
+              </w:rPr>
+              <w:t>TAK</w:t>
+            </w:r>
+          </w:p>
+        </w:tc>
+      </w:tr>
+      <w:tr>
+        <w:tc>
+          <w:tcPr>
+            <w:tcW w:type="dxa" w:w="2409"/>
+          </w:tcPr>
+          <w:p>
+            <w:r/>
+            <w:r>
+              <w:rPr>
+                <w:rFonts w:ascii="Times New Roman" w:hAnsi="Times New Roman" w:eastAsia="Times New Roman"/>
+                <w:b w:val="0"/>
+                <w:i w:val="0"/>
+                <w:sz w:val="16"/>
+              </w:rPr>
+              <w:t>Stelaż / rama</w:t>
+            </w:r>
+          </w:p>
+        </w:tc>
+        <w:tc>
+          <w:tcPr>
+            <w:tcW w:type="dxa" w:w="2409"/>
+          </w:tcPr>
+          <w:p>
+            <w:r/>
+            <w:r>
+              <w:rPr>
+                <w:rFonts w:ascii="Times New Roman" w:hAnsi="Times New Roman" w:eastAsia="Times New Roman"/>
+                <w:b w:val="0"/>
+                <w:i w:val="0"/>
+                <w:sz w:val="16"/>
+              </w:rPr>
+              <w:t>aluminiowy lub stalowy</w:t>
+            </w:r>
+          </w:p>
+        </w:tc>
+        <w:tc>
+          <w:tcPr>
+            <w:tcW w:type="dxa" w:w="2409"/>
+          </w:tcPr>
+          <w:p>
+            <w:r/>
+            <w:r>
+              <w:rPr>
+                <w:rFonts w:ascii="Times New Roman" w:hAnsi="Times New Roman" w:eastAsia="Times New Roman"/>
+                <w:b w:val="0"/>
+                <w:i w:val="0"/>
+                <w:sz w:val="16"/>
+              </w:rPr>
+              <w:t>stalowa fi 22</w:t>
+            </w:r>
+          </w:p>
+        </w:tc>
+        <w:tc>
+          <w:tcPr>
+            <w:tcW w:type="dxa" w:w="2409"/>
+          </w:tcPr>
+          <w:p>
+            <w:r/>
+            <w:r>
+              <w:rPr>
+                <w:rFonts w:ascii="Times New Roman" w:hAnsi="Times New Roman" w:eastAsia="Times New Roman"/>
+                <w:b/>
+                <w:i w:val="0"/>
+                <w:sz w:val="16"/>
+              </w:rPr>
+              <w:t>TAK</w:t>
+            </w:r>
+          </w:p>
+        </w:tc>
+      </w:tr>
+      <w:tr>
+        <w:tc>
+          <w:tcPr>
+            <w:tcW w:type="dxa" w:w="2409"/>
+            <w:shd w:fill="F3F3F0" w:val="clear"/>
+          </w:tcPr>
+          <w:p>
+            <w:r/>
+            <w:r>
+              <w:rPr>
+                <w:rFonts w:ascii="Times New Roman" w:hAnsi="Times New Roman" w:eastAsia="Times New Roman"/>
+                <w:b w:val="0"/>
+                <w:i w:val="0"/>
+                <w:sz w:val="16"/>
+              </w:rPr>
+              <w:t>Poszycie</w:t>
+            </w:r>
+          </w:p>
+        </w:tc>
+        <w:tc>
+          <w:tcPr>
+            <w:tcW w:type="dxa" w:w="2409"/>
+            <w:shd w:fill="F3F3F0" w:val="clear"/>
+          </w:tcPr>
+          <w:p>
+            <w:r/>
+            <w:r>
+              <w:rPr>
+                <w:rFonts w:ascii="Times New Roman" w:hAnsi="Times New Roman" w:eastAsia="Times New Roman"/>
+                <w:b w:val="0"/>
+                <w:i w:val="0"/>
+                <w:sz w:val="16"/>
+              </w:rPr>
+              <w:t>oddychające, odporne, do dezynfekcji</w:t>
+            </w:r>
+          </w:p>
+        </w:tc>
+        <w:tc>
+          <w:tcPr>
+            <w:tcW w:type="dxa" w:w="2409"/>
+            <w:shd w:fill="F3F3F0" w:val="clear"/>
+          </w:tcPr>
+          <w:p>
+            <w:r/>
+            <w:r>
+              <w:rPr>
+                <w:rFonts w:ascii="Times New Roman" w:hAnsi="Times New Roman" w:eastAsia="Times New Roman"/>
+                <w:b w:val="0"/>
+                <w:i w:val="0"/>
+                <w:sz w:val="16"/>
+              </w:rPr>
+              <w:t>wodoodporne z pianką</w:t>
+            </w:r>
+          </w:p>
+        </w:tc>
+        <w:tc>
+          <w:tcPr>
+            <w:tcW w:type="dxa" w:w="2409"/>
+            <w:shd w:fill="F3F3F0" w:val="clear"/>
+          </w:tcPr>
+          <w:p>
+            <w:r/>
+            <w:r>
+              <w:rPr>
+                <w:rFonts w:ascii="Times New Roman" w:hAnsi="Times New Roman" w:eastAsia="Times New Roman"/>
+                <w:b/>
+                <w:i w:val="0"/>
+                <w:sz w:val="16"/>
+              </w:rPr>
+              <w:t>TAK</w:t>
+            </w:r>
+          </w:p>
+        </w:tc>
+      </w:tr>
+      <w:tr>
+        <w:tc>
+          <w:tcPr>
+            <w:tcW w:type="dxa" w:w="2409"/>
+          </w:tcPr>
+          <w:p>
+            <w:r/>
+            <w:r>
+              <w:rPr>
+                <w:rFonts w:ascii="Times New Roman" w:hAnsi="Times New Roman" w:eastAsia="Times New Roman"/>
+                <w:b w:val="0"/>
+                <w:i w:val="0"/>
+                <w:sz w:val="16"/>
+              </w:rPr>
+              <w:t>Waga zestawu</w:t>
+            </w:r>
+          </w:p>
+        </w:tc>
+        <w:tc>
+          <w:tcPr>
+            <w:tcW w:type="dxa" w:w="2409"/>
+          </w:tcPr>
+          <w:p>
+            <w:r/>
+            <w:r>
+              <w:rPr>
+                <w:rFonts w:ascii="Times New Roman" w:hAnsi="Times New Roman" w:eastAsia="Times New Roman"/>
+                <w:b w:val="0"/>
+                <w:i w:val="0"/>
+                <w:sz w:val="16"/>
+              </w:rPr>
+              <w:t>do 12 kg</w:t>
+            </w:r>
+          </w:p>
+        </w:tc>
+        <w:tc>
+          <w:tcPr>
+            <w:tcW w:type="dxa" w:w="2409"/>
+          </w:tcPr>
+          <w:p>
+            <w:r/>
+            <w:r>
+              <w:rPr>
+                <w:rFonts w:ascii="Times New Roman" w:hAnsi="Times New Roman" w:eastAsia="Times New Roman"/>
+                <w:b w:val="0"/>
+                <w:i w:val="0"/>
+                <w:sz w:val="16"/>
+              </w:rPr>
+              <w:t>12,5 kg</w:t>
+            </w:r>
+          </w:p>
+        </w:tc>
+        <w:tc>
+          <w:tcPr>
+            <w:tcW w:type="dxa" w:w="2409"/>
+          </w:tcPr>
+          <w:p>
+            <w:r/>
+            <w:r>
+              <w:rPr>
+                <w:rFonts w:ascii="Times New Roman" w:hAnsi="Times New Roman" w:eastAsia="Times New Roman"/>
+                <w:b/>
+                <w:i w:val="0"/>
+                <w:sz w:val="16"/>
+              </w:rPr>
+              <w:t>UWAGA***</w:t>
+            </w:r>
+          </w:p>
+        </w:tc>
+      </w:tr>
+      <w:tr>
+        <w:tc>
+          <w:tcPr>
+            <w:tcW w:type="dxa" w:w="2409"/>
+            <w:shd w:fill="F3F3F0" w:val="clear"/>
+          </w:tcPr>
+          <w:p>
+            <w:r/>
+            <w:r>
+              <w:rPr>
+                <w:rFonts w:ascii="Times New Roman" w:hAnsi="Times New Roman" w:eastAsia="Times New Roman"/>
+                <w:b w:val="0"/>
+                <w:i w:val="0"/>
+                <w:sz w:val="16"/>
+              </w:rPr>
+              <w:t>Ilość</w:t>
+            </w:r>
+          </w:p>
+        </w:tc>
+        <w:tc>
+          <w:tcPr>
+            <w:tcW w:type="dxa" w:w="2409"/>
+            <w:shd w:fill="F3F3F0" w:val="clear"/>
+          </w:tcPr>
+          <w:p>
+            <w:r/>
+            <w:r>
+              <w:rPr>
+                <w:rFonts w:ascii="Times New Roman" w:hAnsi="Times New Roman" w:eastAsia="Times New Roman"/>
+                <w:b w:val="0"/>
+                <w:i w:val="0"/>
+                <w:sz w:val="16"/>
+              </w:rPr>
+              <w:t>15 szt.</w:t>
+            </w:r>
+          </w:p>
+        </w:tc>
+        <w:tc>
+          <w:tcPr>
+            <w:tcW w:type="dxa" w:w="2409"/>
+            <w:shd w:fill="F3F3F0" w:val="clear"/>
+          </w:tcPr>
+          <w:p>
+            <w:r/>
+            <w:r>
+              <w:rPr>
+                <w:rFonts w:ascii="Times New Roman" w:hAnsi="Times New Roman" w:eastAsia="Times New Roman"/>
+                <w:b w:val="0"/>
+                <w:i w:val="0"/>
+                <w:sz w:val="16"/>
+              </w:rPr>
+              <w:t>15 szt.</w:t>
+            </w:r>
+          </w:p>
+        </w:tc>
+        <w:tc>
+          <w:tcPr>
+            <w:tcW w:type="dxa" w:w="2409"/>
+            <w:shd w:fill="F3F3F0" w:val="clear"/>
+          </w:tcPr>
+          <w:p>
+            <w:r/>
+            <w:r>
+              <w:rPr>
+                <w:rFonts w:ascii="Times New Roman" w:hAnsi="Times New Roman" w:eastAsia="Times New Roman"/>
+                <w:b/>
+                <w:i w:val="0"/>
+                <w:sz w:val="16"/>
+              </w:rPr>
+              <w:t>TAK</w:t>
+            </w:r>
+          </w:p>
+        </w:tc>
+      </w:tr>
+      <w:tr>
+        <w:tc>
+          <w:tcPr>
+            <w:tcW w:type="dxa" w:w="2409"/>
+          </w:tcPr>
+          <w:p>
+            <w:r/>
+            <w:r>
+              <w:rPr>
+                <w:rFonts w:ascii="Times New Roman" w:hAnsi="Times New Roman" w:eastAsia="Times New Roman"/>
+                <w:b w:val="0"/>
+                <w:i w:val="0"/>
+                <w:sz w:val="16"/>
+              </w:rPr>
+              <w:t>Termin dostawy</w:t>
+            </w:r>
+          </w:p>
+        </w:tc>
+        <w:tc>
+          <w:tcPr>
+            <w:tcW w:type="dxa" w:w="2409"/>
+          </w:tcPr>
+          <w:p>
+            <w:r/>
+            <w:r>
+              <w:rPr>
+                <w:rFonts w:ascii="Times New Roman" w:hAnsi="Times New Roman" w:eastAsia="Times New Roman"/>
+                <w:b w:val="0"/>
+                <w:i w:val="0"/>
+                <w:sz w:val="16"/>
+              </w:rPr>
+              <w:t>do 30.11.2026 r.</w:t>
+            </w:r>
+          </w:p>
+        </w:tc>
+        <w:tc>
+          <w:tcPr>
+            <w:tcW w:type="dxa" w:w="2409"/>
+          </w:tcPr>
+          <w:p>
+            <w:r/>
+            <w:r>
+              <w:rPr>
+                <w:rFonts w:ascii="Times New Roman" w:hAnsi="Times New Roman" w:eastAsia="Times New Roman"/>
+                <w:b w:val="0"/>
+                <w:i w:val="0"/>
+                <w:sz w:val="16"/>
+              </w:rPr>
+              <w:t>do 30.11.2026 r.</w:t>
+            </w:r>
+          </w:p>
+        </w:tc>
+        <w:tc>
+          <w:tcPr>
+            <w:tcW w:type="dxa" w:w="2409"/>
+          </w:tcPr>
+          <w:p>
+            <w:r/>
+            <w:r>
+              <w:rPr>
+                <w:rFonts w:ascii="Times New Roman" w:hAnsi="Times New Roman" w:eastAsia="Times New Roman"/>
+                <w:b/>
+                <w:i w:val="0"/>
+                <w:sz w:val="16"/>
+              </w:rPr>
+              <w:t>TAK</w:t>
+            </w:r>
+          </w:p>
+        </w:tc>
+      </w:tr>
+      <w:tr>
+        <w:tc>
+          <w:tcPr>
+            <w:tcW w:type="dxa" w:w="2409"/>
+            <w:shd w:fill="F3F3F0" w:val="clear"/>
+          </w:tcPr>
+          <w:p>
+            <w:r/>
+            <w:r>
+              <w:rPr>
+                <w:rFonts w:ascii="Times New Roman" w:hAnsi="Times New Roman" w:eastAsia="Times New Roman"/>
+                <w:b w:val="0"/>
+                <w:i w:val="0"/>
+                <w:sz w:val="16"/>
+              </w:rPr>
+              <w:t>Gwarancja</w:t>
+            </w:r>
+          </w:p>
+        </w:tc>
+        <w:tc>
+          <w:tcPr>
+            <w:tcW w:type="dxa" w:w="2409"/>
+            <w:shd w:fill="F3F3F0" w:val="clear"/>
+          </w:tcPr>
+          <w:p>
+            <w:r/>
+            <w:r>
+              <w:rPr>
+                <w:rFonts w:ascii="Times New Roman" w:hAnsi="Times New Roman" w:eastAsia="Times New Roman"/>
+                <w:b w:val="0"/>
+                <w:i w:val="0"/>
+                <w:sz w:val="16"/>
+              </w:rPr>
+              <w:t>gwarancja producenta</w:t>
+            </w:r>
+          </w:p>
+        </w:tc>
+        <w:tc>
+          <w:tcPr>
+            <w:tcW w:type="dxa" w:w="2409"/>
+            <w:shd w:fill="F3F3F0" w:val="clear"/>
+          </w:tcPr>
+          <w:p>
+            <w:r/>
+            <w:r>
+              <w:rPr>
+                <w:rFonts w:ascii="Times New Roman" w:hAnsi="Times New Roman" w:eastAsia="Times New Roman"/>
+                <w:b w:val="0"/>
+                <w:i w:val="0"/>
+                <w:sz w:val="16"/>
+              </w:rPr>
+              <w:t>24 miesiące</w:t>
+            </w:r>
+          </w:p>
+        </w:tc>
+        <w:tc>
+          <w:tcPr>
+            <w:tcW w:type="dxa" w:w="2409"/>
+            <w:shd w:fill="F3F3F0" w:val="clear"/>
+          </w:tcPr>
+          <w:p>
+            <w:r/>
+            <w:r>
+              <w:rPr>
+                <w:rFonts w:ascii="Times New Roman" w:hAnsi="Times New Roman" w:eastAsia="Times New Roman"/>
+                <w:b/>
+                <w:i w:val="0"/>
+                <w:sz w:val="16"/>
+              </w:rPr>
+              <w:t>TAK</w:t>
+            </w:r>
+          </w:p>
+        </w:tc>
+      </w:tr>
+    </w:tbl>
+    <w:p>
+      <w:pPr>
+        <w:spacing w:after="160" w:before="0"/>
+        <w:jc w:val="left"/>
+      </w:pPr>
+    </w:p>
+    <w:p>
+      <w:pPr>
+        <w:spacing w:after="40" w:before="0"/>
+        <w:jc w:val="left"/>
+      </w:pPr>
+      <w:r>
+        <w:rPr>
+          <w:rFonts w:ascii="Times New Roman" w:hAnsi="Times New Roman" w:eastAsia="Times New Roman"/>
+          <w:b w:val="0"/>
+          <w:i w:val="0"/>
+          <w:sz w:val="16"/>
+        </w:rPr>
+        <w:t>* Wysokość użytkowa modelu kwaterunkowego WP5-2 w wariancie szpitalnym podawana jako 30 cm; wariant standardowy w podobnym zakresie.</w:t>
+      </w:r>
+    </w:p>
+    <w:p>
+      <w:pPr>
+        <w:spacing w:after="40" w:before="0"/>
+        <w:jc w:val="left"/>
+      </w:pPr>
+      <w:r>
+        <w:rPr>
+          <w:rFonts w:ascii="Times New Roman" w:hAnsi="Times New Roman" w:eastAsia="Times New Roman"/>
+          <w:b w:val="0"/>
+          <w:i w:val="0"/>
+          <w:sz w:val="16"/>
+        </w:rPr>
+        <w:t>** Wymiary złożenia podane jako 70/15/85 cm (kolejność osi wg karty produktu) — mieszczą się w rzędzie wielkości wskazanym przez Zamawiającego („ok.”).</w:t>
+      </w:r>
+    </w:p>
+    <w:p>
+      <w:pPr>
+        <w:spacing w:after="200" w:before="0"/>
+        <w:jc w:val="left"/>
+      </w:pPr>
+      <w:r>
+        <w:rPr>
+          <w:rFonts w:ascii="Times New Roman" w:hAnsi="Times New Roman" w:eastAsia="Times New Roman"/>
+          <w:b w:val="0"/>
+          <w:i w:val="0"/>
+          <w:sz w:val="16"/>
+        </w:rPr>
+        <w:t>*** Waga katalogowa 12,5 kg przekracza o 0,5 kg próg „do 12 kg”. Przy twardym limicie możliwe zastąpienie modelem L8 (12 kg, udźwig 120 kg).</w:t>
+      </w:r>
+    </w:p>
+    <w:p>
+      <w:pPr>
+        <w:spacing w:after="80" w:before="0"/>
+        <w:jc w:val="left"/>
+      </w:pPr>
+      <w:r>
+        <w:rPr>
+          <w:rFonts w:ascii="Times New Roman" w:hAnsi="Times New Roman" w:eastAsia="Times New Roman"/>
+          <w:b/>
+          <w:i w:val="0"/>
+          <w:sz w:val="22"/>
+        </w:rPr>
+        <w:t>Cena jednostkowa i wartość</w:t>
+      </w:r>
+    </w:p>
+    <w:p>
+      <w:pPr>
+        <w:spacing w:after="40" w:before="0"/>
+        <w:jc w:val="left"/>
+      </w:pPr>
+      <w:r>
+        <w:rPr>
+          <w:rFonts w:ascii="Times New Roman" w:hAnsi="Times New Roman" w:eastAsia="Times New Roman"/>
+          <w:b w:val="0"/>
+          <w:i w:val="0"/>
+          <w:sz w:val="20"/>
+        </w:rPr>
+        <w:t>Cena jednostkowa netto: 420,00 zł</w:t>
+      </w:r>
+    </w:p>
+    <w:p>
+      <w:pPr>
+        <w:spacing w:after="40" w:before="0"/>
+        <w:jc w:val="left"/>
+      </w:pPr>
+      <w:r>
+        <w:rPr>
+          <w:rFonts w:ascii="Times New Roman" w:hAnsi="Times New Roman" w:eastAsia="Times New Roman"/>
+          <w:b w:val="0"/>
+          <w:i w:val="0"/>
+          <w:sz w:val="20"/>
+        </w:rPr>
+        <w:t>Cena jednostkowa brutto: 516,60 zł</w:t>
+      </w:r>
+    </w:p>
+    <w:p>
+      <w:pPr>
+        <w:spacing w:after="40" w:before="0"/>
+        <w:jc w:val="left"/>
+      </w:pPr>
+      <w:r>
+        <w:rPr>
+          <w:rFonts w:ascii="Times New Roman" w:hAnsi="Times New Roman" w:eastAsia="Times New Roman"/>
+          <w:b w:val="0"/>
+          <w:i w:val="0"/>
+          <w:sz w:val="20"/>
+        </w:rPr>
+        <w:t>Ilość: 15 szt.</w:t>
+      </w:r>
+    </w:p>
+    <w:p>
+      <w:pPr>
+        <w:spacing w:after="40" w:before="0"/>
+        <w:jc w:val="left"/>
+      </w:pPr>
+      <w:r>
+        <w:rPr>
+          <w:rFonts w:ascii="Times New Roman" w:hAnsi="Times New Roman" w:eastAsia="Times New Roman"/>
+          <w:b w:val="0"/>
+          <w:i w:val="0"/>
+          <w:sz w:val="20"/>
+        </w:rPr>
+        <w:t>Wartość netto: 6 300,00 zł</w:t>
+      </w:r>
+    </w:p>
+    <w:p>
+      <w:pPr>
+        <w:spacing w:after="40" w:before="0"/>
+        <w:jc w:val="left"/>
+      </w:pPr>
+      <w:r>
+        <w:rPr>
+          <w:rFonts w:ascii="Times New Roman" w:hAnsi="Times New Roman" w:eastAsia="Times New Roman"/>
+          <w:b w:val="0"/>
+          <w:i w:val="0"/>
+          <w:sz w:val="20"/>
+        </w:rPr>
+        <w:t>VAT 23%: 1 449,00 zł</w:t>
+      </w:r>
+    </w:p>
+    <w:p>
+      <w:pPr>
+        <w:spacing w:after="40" w:before="0"/>
+        <w:jc w:val="left"/>
+      </w:pPr>
+      <w:r>
+        <w:rPr>
+          <w:rFonts w:ascii="Times New Roman" w:hAnsi="Times New Roman" w:eastAsia="Times New Roman"/>
+          <w:b w:val="0"/>
+          <w:i w:val="0"/>
+          <w:sz w:val="20"/>
+        </w:rPr>
+        <w:t>Wartość brutto: 7 749,00 zł</w:t>
+      </w:r>
+    </w:p>
+    <w:p>
+      <w:pPr>
+        <w:spacing w:after="200" w:before="0"/>
+        <w:jc w:val="left"/>
+      </w:pPr>
+    </w:p>
+    <w:tbl>
+      <w:tblPr>
+        <w:tblW w:type="auto" w:w="0"/>
+        <w:tblLook w:firstColumn="1" w:firstRow="1" w:lastColumn="0" w:lastRow="0" w:noHBand="0" w:noVBand="1" w:val="04A0"/>
+      </w:tblPr>
+      <w:tblGrid>
+        <w:gridCol w:w="4819"/>
+        <w:gridCol w:w="4819"/>
+      </w:tblGrid>
+      <w:tr>
+        <w:tc>
+          <w:tcPr>
+            <w:tcW w:type="dxa" w:w="4819"/>
+          </w:tcPr>
+          <w:p>
+            <w:r>
+              <w:rPr>
+                <w:rFonts w:ascii="Times New Roman" w:hAnsi="Times New Roman" w:eastAsia="Times New Roman"/>
+                <w:b w:val="0"/>
+                <w:i w:val="0"/>
+                <w:sz w:val="20"/>
+              </w:rPr>
+              <w:t>Częstochowa, 30.10.2026 r.</w:t>
+            </w:r>
+          </w:p>
+        </w:tc>
+        <w:tc>
+          <w:tcPr>
+            <w:tcW w:type="dxa" w:w="4819"/>
+          </w:tcPr>
+          <w:p>
+            <w:pPr>
+              <w:jc w:val="center"/>
+            </w:pPr>
+            <w:r>
+              <w:rPr>
+                <w:rFonts w:ascii="Times New Roman" w:hAnsi="Times New Roman" w:eastAsia="Times New Roman"/>
+                <w:b w:val="0"/>
+                <w:i w:val="0"/>
+                <w:sz w:val="20"/>
+              </w:rPr>
+              <w:t>................................................</w:t>
+              <w:br/>
+            </w:r>
+            <w:r>
+              <w:rPr>
+                <w:rFonts w:ascii="Times New Roman" w:hAnsi="Times New Roman" w:eastAsia="Times New Roman"/>
+                <w:b/>
+                <w:i w:val="0"/>
+                <w:sz w:val="20"/>
+              </w:rPr>
+              <w:t>P.P.U.H. M-ELEKTROSTATYK</w:t>
+            </w:r>
+          </w:p>
+        </w:tc>
+      </w:tr>
+    </w:tbl>
     <w:sectPr>
-      <w:pgSz w:w="12240" w:h="15840"/>
-      <w:pgMar w:top="1020" w:right="1134" w:bottom="1020" w:left="1134" w:header="720" w:footer="720" w:gutter="0"/>
+      <w:pgSz w:w="11906" w:h="16838"/>
+      <w:pgMar w:top="907" w:right="1134" w:bottom="907" w:left="1134" w:header="720" w:footer="720" w:gutter="0"/>
       <w:cols w:space="720"/>
       <w:docGrid w:linePitch="360"/>
     </w:sectPr>
@@ -1118,6 +2478,9 @@
     <w:name w:val="Normal"/>
     <w:qFormat/>
     <w:rsid w:val="00FC693F"/>
+    <w:pPr>
+      <w:spacing w:after="40" w:before="0"/>
+    </w:pPr>
     <w:rPr>
       <w:rFonts w:ascii="Times New Roman" w:hAnsi="Times New Roman" w:eastAsia="Times New Roman"/>
       <w:sz w:val="22"/>

</xml_diff>